<commit_message>
Ajout de la license dans les gabarits et le fichier de consignes
</commit_message>
<xml_diff>
--- a/Consignes d'utilisation pour étudiants.docx
+++ b/Consignes d'utilisation pour étudiants.docx
@@ -114,6 +114,7 @@
           <w:lang w:val="fr-CA"/>
         </w:rPr>
       </w:pPr>
+      <w:proofErr w:type="gramStart"/>
       <w:r>
         <w:rPr>
           <w:lang w:val="fr-CA"/>
@@ -124,7 +125,14 @@
         <w:rPr>
           <w:lang w:val="fr-CA"/>
         </w:rPr>
-        <w:t xml:space="preserve">leu : aucun </w:t>
+        <w:t>leu</w:t>
+      </w:r>
+      <w:proofErr w:type="gramEnd"/>
+      <w:r>
+        <w:rPr>
+          <w:lang w:val="fr-CA"/>
+        </w:rPr>
+        <w:t xml:space="preserve"> : aucun </w:t>
       </w:r>
       <w:r>
         <w:rPr>
@@ -348,7 +356,7 @@
                     <pic:cNvPicPr/>
                   </pic:nvPicPr>
                   <pic:blipFill>
-                    <a:blip r:embed="rId5">
+                    <a:blip r:embed="rId7">
                       <a:extLst>
                         <a:ext uri="{28A0092B-C50C-407E-A947-70E740481C1C}">
                           <a14:useLocalDpi xmlns:a14="http://schemas.microsoft.com/office/drawing/2010/main" val="0"/>
@@ -520,7 +528,7 @@
                     <pic:cNvPicPr/>
                   </pic:nvPicPr>
                   <pic:blipFill>
-                    <a:blip r:embed="rId6">
+                    <a:blip r:embed="rId8">
                       <a:extLst>
                         <a:ext uri="{28A0092B-C50C-407E-A947-70E740481C1C}">
                           <a14:useLocalDpi xmlns:a14="http://schemas.microsoft.com/office/drawing/2010/main" val="0"/>
@@ -673,7 +681,7 @@
           <w:lang w:val="fr-CA"/>
         </w:rPr>
         <w:drawing>
-          <wp:inline distT="0" distB="0" distL="0" distR="0" wp14:anchorId="667A8110" wp14:editId="4AA1F744">
+          <wp:inline distT="0" distB="0" distL="0" distR="0" wp14:anchorId="667A8110" wp14:editId="1349C801">
             <wp:extent cx="889913" cy="2276793"/>
             <wp:effectExtent l="0" t="0" r="5715" b="0"/>
             <wp:docPr id="40421987" name="Image 5"/>
@@ -688,7 +696,7 @@
                     <pic:cNvPicPr/>
                   </pic:nvPicPr>
                   <pic:blipFill>
-                    <a:blip r:embed="rId7" cstate="print">
+                    <a:blip r:embed="rId9" cstate="print">
                       <a:extLst>
                         <a:ext uri="{28A0092B-C50C-407E-A947-70E740481C1C}">
                           <a14:useLocalDpi xmlns:a14="http://schemas.microsoft.com/office/drawing/2010/main" val="0"/>
@@ -811,6 +819,7 @@
           <w:noProof/>
           <w:lang w:val="fr-CA"/>
         </w:rPr>
+        <w:lastRenderedPageBreak/>
         <w:drawing>
           <wp:inline distT="0" distB="0" distL="0" distR="0" wp14:anchorId="5BC069F5" wp14:editId="7FADB8B0">
             <wp:extent cx="3553321" cy="1524213"/>
@@ -827,7 +836,7 @@
                     <pic:cNvPicPr/>
                   </pic:nvPicPr>
                   <pic:blipFill>
-                    <a:blip r:embed="rId8">
+                    <a:blip r:embed="rId10">
                       <a:extLst>
                         <a:ext uri="{28A0092B-C50C-407E-A947-70E740481C1C}">
                           <a14:useLocalDpi xmlns:a14="http://schemas.microsoft.com/office/drawing/2010/main" val="0"/>
@@ -926,6 +935,7 @@
       </w:r>
     </w:p>
     <w:sectPr>
+      <w:footerReference w:type="default" r:id="rId11"/>
       <w:pgSz w:w="12240" w:h="15840"/>
       <w:pgMar w:top="1440" w:right="1800" w:bottom="1440" w:left="1800" w:header="708" w:footer="708" w:gutter="0"/>
       <w:cols w:space="708"/>
@@ -933,6 +943,214 @@
     </w:sectPr>
   </w:body>
 </w:document>
+</file>
+
+<file path=word/endnotes.xml><?xml version="1.0" encoding="utf-8"?>
+<w:endnotes xmlns:wpc="http://schemas.microsoft.com/office/word/2010/wordprocessingCanvas" xmlns:cx="http://schemas.microsoft.com/office/drawing/2014/chartex" xmlns:cx1="http://schemas.microsoft.com/office/drawing/2015/9/8/chartex" xmlns:cx2="http://schemas.microsoft.com/office/drawing/2015/10/21/chartex" xmlns:cx3="http://schemas.microsoft.com/office/drawing/2016/5/9/chartex" xmlns:cx4="http://schemas.microsoft.com/office/drawing/2016/5/10/chartex" xmlns:cx5="http://schemas.microsoft.com/office/drawing/2016/5/11/chartex" xmlns:cx6="http://schemas.microsoft.com/office/drawing/2016/5/12/chartex" xmlns:cx7="http://schemas.microsoft.com/office/drawing/2016/5/13/chartex" xmlns:cx8="http://schemas.microsoft.com/office/drawing/2016/5/14/chartex" xmlns:mc="http://schemas.openxmlformats.org/markup-compatibility/2006" xmlns:aink="http://schemas.microsoft.com/office/drawing/2016/ink" xmlns:am3d="http://schemas.microsoft.com/office/drawing/2017/model3d" xmlns:o="urn:schemas-microsoft-com:office:office" xmlns:oel="http://schemas.microsoft.com/office/2019/extlst" xmlns:r="http://schemas.openxmlformats.org/officeDocument/2006/relationships" xmlns:m="http://schemas.openxmlformats.org/officeDocument/2006/math" xmlns:v="urn:schemas-microsoft-com:vml" xmlns:wp14="http://schemas.microsoft.com/office/word/2010/wordprocessingDrawing" xmlns:wp="http://schemas.openxmlformats.org/drawingml/2006/wordprocessingDrawing" xmlns:w10="urn:schemas-microsoft-com:office:word" xmlns:w="http://schemas.openxmlformats.org/wordprocessingml/2006/main" xmlns:w14="http://schemas.microsoft.com/office/word/2010/wordml" xmlns:w15="http://schemas.microsoft.com/office/word/2012/wordml" xmlns:w16cex="http://schemas.microsoft.com/office/word/2018/wordml/cex" xmlns:w16cid="http://schemas.microsoft.com/office/word/2016/wordml/cid" xmlns:w16="http://schemas.microsoft.com/office/word/2018/wordml" xmlns:w16du="http://schemas.microsoft.com/office/word/2023/wordml/word16du" xmlns:w16sdtdh="http://schemas.microsoft.com/office/word/2020/wordml/sdtdatahash" xmlns:w16sdtfl="http://schemas.microsoft.com/office/word/2024/wordml/sdtformatlock" xmlns:w16se="http://schemas.microsoft.com/office/word/2015/wordml/symex" xmlns:wpg="http://schemas.microsoft.com/office/word/2010/wordprocessingGroup" xmlns:wpi="http://schemas.microsoft.com/office/word/2010/wordprocessingInk" xmlns:wne="http://schemas.microsoft.com/office/word/2006/wordml" xmlns:wps="http://schemas.microsoft.com/office/word/2010/wordprocessingShape" mc:Ignorable="w14 w15 w16se w16cid w16 w16cex w16sdtdh w16sdtfl w16du wp14">
+  <w:endnote w:type="separator" w:id="-1">
+    <w:p>
+      <w:pPr>
+        <w:spacing w:after="0" w:line="240" w:lineRule="auto"/>
+      </w:pPr>
+      <w:r>
+        <w:separator/>
+      </w:r>
+    </w:p>
+  </w:endnote>
+  <w:endnote w:type="continuationSeparator" w:id="0">
+    <w:p>
+      <w:pPr>
+        <w:spacing w:after="0" w:line="240" w:lineRule="auto"/>
+      </w:pPr>
+      <w:r>
+        <w:continuationSeparator/>
+      </w:r>
+    </w:p>
+  </w:endnote>
+</w:endnotes>
+</file>
+
+<file path=word/footer1.xml><?xml version="1.0" encoding="utf-8"?>
+<w:ftr xmlns:wpc="http://schemas.microsoft.com/office/word/2010/wordprocessingCanvas" xmlns:cx="http://schemas.microsoft.com/office/drawing/2014/chartex" xmlns:cx1="http://schemas.microsoft.com/office/drawing/2015/9/8/chartex" xmlns:cx2="http://schemas.microsoft.com/office/drawing/2015/10/21/chartex" xmlns:cx3="http://schemas.microsoft.com/office/drawing/2016/5/9/chartex" xmlns:cx4="http://schemas.microsoft.com/office/drawing/2016/5/10/chartex" xmlns:cx5="http://schemas.microsoft.com/office/drawing/2016/5/11/chartex" xmlns:cx6="http://schemas.microsoft.com/office/drawing/2016/5/12/chartex" xmlns:cx7="http://schemas.microsoft.com/office/drawing/2016/5/13/chartex" xmlns:cx8="http://schemas.microsoft.com/office/drawing/2016/5/14/chartex" xmlns:mc="http://schemas.openxmlformats.org/markup-compatibility/2006" xmlns:aink="http://schemas.microsoft.com/office/drawing/2016/ink" xmlns:am3d="http://schemas.microsoft.com/office/drawing/2017/model3d" xmlns:o="urn:schemas-microsoft-com:office:office" xmlns:oel="http://schemas.microsoft.com/office/2019/extlst" xmlns:r="http://schemas.openxmlformats.org/officeDocument/2006/relationships" xmlns:m="http://schemas.openxmlformats.org/officeDocument/2006/math" xmlns:v="urn:schemas-microsoft-com:vml" xmlns:wp14="http://schemas.microsoft.com/office/word/2010/wordprocessingDrawing" xmlns:wp="http://schemas.openxmlformats.org/drawingml/2006/wordprocessingDrawing" xmlns:w10="urn:schemas-microsoft-com:office:word" xmlns:w="http://schemas.openxmlformats.org/wordprocessingml/2006/main" xmlns:w14="http://schemas.microsoft.com/office/word/2010/wordml" xmlns:w15="http://schemas.microsoft.com/office/word/2012/wordml" xmlns:w16cex="http://schemas.microsoft.com/office/word/2018/wordml/cex" xmlns:w16cid="http://schemas.microsoft.com/office/word/2016/wordml/cid" xmlns:w16="http://schemas.microsoft.com/office/word/2018/wordml" xmlns:w16du="http://schemas.microsoft.com/office/word/2023/wordml/word16du" xmlns:w16sdtdh="http://schemas.microsoft.com/office/word/2020/wordml/sdtdatahash" xmlns:w16sdtfl="http://schemas.microsoft.com/office/word/2024/wordml/sdtformatlock" xmlns:w16se="http://schemas.microsoft.com/office/word/2015/wordml/symex" xmlns:wpg="http://schemas.microsoft.com/office/word/2010/wordprocessingGroup" xmlns:wpi="http://schemas.microsoft.com/office/word/2010/wordprocessingInk" xmlns:wne="http://schemas.microsoft.com/office/word/2006/wordml" xmlns:wps="http://schemas.microsoft.com/office/word/2010/wordprocessingShape" mc:Ignorable="w14 w15 w16se w16cid w16 w16cex w16sdtdh w16sdtfl w16du wp14">
+  <w:p>
+    <w:pPr>
+      <w:ind w:left="851"/>
+      <w:jc w:val="right"/>
+      <w:rPr>
+        <w:rFonts w:eastAsiaTheme="majorEastAsia" w:cs="Arial"/>
+        <w:color w:val="0F4761" w:themeColor="accent1" w:themeShade="BF"/>
+        <w:sz w:val="22"/>
+        <w:szCs w:val="22"/>
+      </w:rPr>
+    </w:pPr>
+    <w:r>
+      <w:rPr>
+        <w:rFonts w:cs="Arial"/>
+        <w:noProof/>
+        <w:sz w:val="20"/>
+        <w:szCs w:val="20"/>
+      </w:rPr>
+      <w:drawing>
+        <wp:anchor distT="0" distB="0" distL="114300" distR="114300" simplePos="0" relativeHeight="251659264" behindDoc="0" locked="0" layoutInCell="1" allowOverlap="1" wp14:anchorId="2A7E2B83" wp14:editId="45581AA7">
+          <wp:simplePos x="0" y="0"/>
+          <wp:positionH relativeFrom="column">
+            <wp:posOffset>4559974</wp:posOffset>
+          </wp:positionH>
+          <wp:positionV relativeFrom="paragraph">
+            <wp:posOffset>74295</wp:posOffset>
+          </wp:positionV>
+          <wp:extent cx="984885" cy="358140"/>
+          <wp:effectExtent l="0" t="0" r="5715" b="3810"/>
+          <wp:wrapSquare wrapText="bothSides"/>
+          <wp:docPr id="906972568" name="Image 1" descr="Une image contenant symbole, logo, boule de billard&#10;&#10;Le contenu généré par l’IA peut être incorrect."/>
+          <wp:cNvGraphicFramePr>
+            <a:graphicFrameLocks xmlns:a="http://schemas.openxmlformats.org/drawingml/2006/main" noChangeAspect="1"/>
+          </wp:cNvGraphicFramePr>
+          <a:graphic xmlns:a="http://schemas.openxmlformats.org/drawingml/2006/main">
+            <a:graphicData uri="http://schemas.openxmlformats.org/drawingml/2006/picture">
+              <pic:pic xmlns:pic="http://schemas.openxmlformats.org/drawingml/2006/picture">
+                <pic:nvPicPr>
+                  <pic:cNvPr id="906972568" name="Image 1" descr="Une image contenant symbole, logo, boule de billard&#10;&#10;Le contenu généré par l’IA peut être incorrect."/>
+                  <pic:cNvPicPr/>
+                </pic:nvPicPr>
+                <pic:blipFill rotWithShape="1">
+                  <a:blip r:embed="rId1">
+                    <a:extLst>
+                      <a:ext uri="{28A0092B-C50C-407E-A947-70E740481C1C}">
+                        <a14:useLocalDpi xmlns:a14="http://schemas.microsoft.com/office/drawing/2010/main" val="0"/>
+                      </a:ext>
+                    </a:extLst>
+                  </a:blip>
+                  <a:srcRect l="10829" t="23581" r="10358" b="24536"/>
+                  <a:stretch>
+                    <a:fillRect/>
+                  </a:stretch>
+                </pic:blipFill>
+                <pic:spPr bwMode="auto">
+                  <a:xfrm>
+                    <a:off x="0" y="0"/>
+                    <a:ext cx="984885" cy="358140"/>
+                  </a:xfrm>
+                  <a:prstGeom prst="rect">
+                    <a:avLst/>
+                  </a:prstGeom>
+                  <a:ln>
+                    <a:noFill/>
+                  </a:ln>
+                  <a:extLst>
+                    <a:ext uri="{53640926-AAD7-44D8-BBD7-CCE9431645EC}">
+                      <a14:shadowObscured xmlns:a14="http://schemas.microsoft.com/office/drawing/2010/main"/>
+                    </a:ext>
+                  </a:extLst>
+                </pic:spPr>
+              </pic:pic>
+            </a:graphicData>
+          </a:graphic>
+          <wp14:sizeRelH relativeFrom="margin">
+            <wp14:pctWidth>0</wp14:pctWidth>
+          </wp14:sizeRelH>
+          <wp14:sizeRelV relativeFrom="margin">
+            <wp14:pctHeight>0</wp14:pctHeight>
+          </wp14:sizeRelV>
+        </wp:anchor>
+      </w:drawing>
+    </w:r>
+    <w:r>
+      <w:rPr>
+        <w:rFonts w:cs="Arial"/>
+        <w:sz w:val="20"/>
+        <w:szCs w:val="20"/>
+        <w:lang w:val="fr-CA"/>
+      </w:rPr>
+      <w:t xml:space="preserve">Cette ressource fait partie de : Rossignol, J. (2025). </w:t>
+    </w:r>
+    <w:r>
+      <w:rPr>
+        <w:rFonts w:cs="Arial"/>
+        <w:i/>
+        <w:iCs/>
+        <w:sz w:val="20"/>
+        <w:szCs w:val="20"/>
+        <w:lang w:val="fr-CA"/>
+      </w:rPr>
+      <w:t>Oscilloscope virtuel</w:t>
+    </w:r>
+    <w:r>
+      <w:rPr>
+        <w:rFonts w:cs="Arial"/>
+        <w:sz w:val="20"/>
+        <w:szCs w:val="20"/>
+        <w:lang w:val="fr-CA"/>
+      </w:rPr>
+      <w:t xml:space="preserve">. Université de Sherbrooke, Département de génie électrique et de génie informatique. </w:t>
+    </w:r>
+    <w:hyperlink r:id="rId2" w:tgtFrame="_blank" w:tooltip="https://creativecommons.org/licenses/by-sa/4.0/deed.fr" w:history="1">
+      <w:r>
+        <w:rPr>
+          <w:rStyle w:val="Lienhypertexte"/>
+          <w:rFonts w:cs="Arial"/>
+          <w:sz w:val="20"/>
+          <w:szCs w:val="20"/>
+        </w:rPr>
+        <w:t xml:space="preserve">Sous </w:t>
+      </w:r>
+      <w:proofErr w:type="spellStart"/>
+      <w:r>
+        <w:rPr>
+          <w:rStyle w:val="Lienhypertexte"/>
+          <w:rFonts w:cs="Arial"/>
+          <w:sz w:val="20"/>
+          <w:szCs w:val="20"/>
+        </w:rPr>
+        <w:t>licence</w:t>
+      </w:r>
+      <w:proofErr w:type="spellEnd"/>
+      <w:r>
+        <w:rPr>
+          <w:rStyle w:val="Lienhypertexte"/>
+          <w:rFonts w:cs="Arial"/>
+          <w:sz w:val="20"/>
+          <w:szCs w:val="20"/>
+        </w:rPr>
+        <w:t xml:space="preserve"> CC BY-SA 4.0 International.</w:t>
+      </w:r>
+    </w:hyperlink>
+    <w:r>
+      <w:rPr>
+        <w:rFonts w:cs="Arial"/>
+        <w:noProof/>
+        <w:sz w:val="22"/>
+        <w:szCs w:val="22"/>
+      </w:rPr>
+      <w:t xml:space="preserve"> </w:t>
+    </w:r>
+  </w:p>
+</w:ftr>
+</file>
+
+<file path=word/footnotes.xml><?xml version="1.0" encoding="utf-8"?>
+<w:footnotes xmlns:wpc="http://schemas.microsoft.com/office/word/2010/wordprocessingCanvas" xmlns:cx="http://schemas.microsoft.com/office/drawing/2014/chartex" xmlns:cx1="http://schemas.microsoft.com/office/drawing/2015/9/8/chartex" xmlns:cx2="http://schemas.microsoft.com/office/drawing/2015/10/21/chartex" xmlns:cx3="http://schemas.microsoft.com/office/drawing/2016/5/9/chartex" xmlns:cx4="http://schemas.microsoft.com/office/drawing/2016/5/10/chartex" xmlns:cx5="http://schemas.microsoft.com/office/drawing/2016/5/11/chartex" xmlns:cx6="http://schemas.microsoft.com/office/drawing/2016/5/12/chartex" xmlns:cx7="http://schemas.microsoft.com/office/drawing/2016/5/13/chartex" xmlns:cx8="http://schemas.microsoft.com/office/drawing/2016/5/14/chartex" xmlns:mc="http://schemas.openxmlformats.org/markup-compatibility/2006" xmlns:aink="http://schemas.microsoft.com/office/drawing/2016/ink" xmlns:am3d="http://schemas.microsoft.com/office/drawing/2017/model3d" xmlns:o="urn:schemas-microsoft-com:office:office" xmlns:oel="http://schemas.microsoft.com/office/2019/extlst" xmlns:r="http://schemas.openxmlformats.org/officeDocument/2006/relationships" xmlns:m="http://schemas.openxmlformats.org/officeDocument/2006/math" xmlns:v="urn:schemas-microsoft-com:vml" xmlns:wp14="http://schemas.microsoft.com/office/word/2010/wordprocessingDrawing" xmlns:wp="http://schemas.openxmlformats.org/drawingml/2006/wordprocessingDrawing" xmlns:w10="urn:schemas-microsoft-com:office:word" xmlns:w="http://schemas.openxmlformats.org/wordprocessingml/2006/main" xmlns:w14="http://schemas.microsoft.com/office/word/2010/wordml" xmlns:w15="http://schemas.microsoft.com/office/word/2012/wordml" xmlns:w16cex="http://schemas.microsoft.com/office/word/2018/wordml/cex" xmlns:w16cid="http://schemas.microsoft.com/office/word/2016/wordml/cid" xmlns:w16="http://schemas.microsoft.com/office/word/2018/wordml" xmlns:w16du="http://schemas.microsoft.com/office/word/2023/wordml/word16du" xmlns:w16sdtdh="http://schemas.microsoft.com/office/word/2020/wordml/sdtdatahash" xmlns:w16sdtfl="http://schemas.microsoft.com/office/word/2024/wordml/sdtformatlock" xmlns:w16se="http://schemas.microsoft.com/office/word/2015/wordml/symex" xmlns:wpg="http://schemas.microsoft.com/office/word/2010/wordprocessingGroup" xmlns:wpi="http://schemas.microsoft.com/office/word/2010/wordprocessingInk" xmlns:wne="http://schemas.microsoft.com/office/word/2006/wordml" xmlns:wps="http://schemas.microsoft.com/office/word/2010/wordprocessingShape" mc:Ignorable="w14 w15 w16se w16cid w16 w16cex w16sdtdh w16sdtfl w16du wp14">
+  <w:footnote w:type="separator" w:id="-1">
+    <w:p>
+      <w:pPr>
+        <w:spacing w:after="0" w:line="240" w:lineRule="auto"/>
+      </w:pPr>
+      <w:r>
+        <w:separator/>
+      </w:r>
+    </w:p>
+  </w:footnote>
+  <w:footnote w:type="continuationSeparator" w:id="0">
+    <w:p>
+      <w:pPr>
+        <w:spacing w:after="0" w:line="240" w:lineRule="auto"/>
+      </w:pPr>
+      <w:r>
+        <w:continuationSeparator/>
+      </w:r>
+    </w:p>
+  </w:footnote>
+</w:footnotes>
 </file>
 
 <file path=word/numbering.xml><?xml version="1.0" encoding="utf-8"?>
@@ -1993,6 +2211,61 @@
       <w:szCs w:val="18"/>
     </w:rPr>
   </w:style>
+  <w:style w:type="paragraph" w:styleId="En-tte">
+    <w:name w:val="header"/>
+    <w:basedOn w:val="Normal"/>
+    <w:link w:val="En-tteCar"/>
+    <w:uiPriority w:val="99"/>
+    <w:unhideWhenUsed/>
+    <w:rsid w:val="00C4673C"/>
+    <w:pPr>
+      <w:tabs>
+        <w:tab w:val="center" w:pos="4320"/>
+        <w:tab w:val="right" w:pos="8640"/>
+      </w:tabs>
+      <w:spacing w:after="0" w:line="240" w:lineRule="auto"/>
+    </w:pPr>
+  </w:style>
+  <w:style w:type="character" w:customStyle="1" w:styleId="En-tteCar">
+    <w:name w:val="En-tête Car"/>
+    <w:basedOn w:val="Policepardfaut"/>
+    <w:link w:val="En-tte"/>
+    <w:uiPriority w:val="99"/>
+    <w:rsid w:val="00C4673C"/>
+  </w:style>
+  <w:style w:type="paragraph" w:styleId="Pieddepage">
+    <w:name w:val="footer"/>
+    <w:basedOn w:val="Normal"/>
+    <w:link w:val="PieddepageCar"/>
+    <w:uiPriority w:val="99"/>
+    <w:unhideWhenUsed/>
+    <w:rsid w:val="00C4673C"/>
+    <w:pPr>
+      <w:tabs>
+        <w:tab w:val="center" w:pos="4320"/>
+        <w:tab w:val="right" w:pos="8640"/>
+      </w:tabs>
+      <w:spacing w:after="0" w:line="240" w:lineRule="auto"/>
+    </w:pPr>
+  </w:style>
+  <w:style w:type="character" w:customStyle="1" w:styleId="PieddepageCar">
+    <w:name w:val="Pied de page Car"/>
+    <w:basedOn w:val="Policepardfaut"/>
+    <w:link w:val="Pieddepage"/>
+    <w:uiPriority w:val="99"/>
+    <w:rsid w:val="00C4673C"/>
+  </w:style>
+  <w:style w:type="character" w:styleId="Lienhypertexte">
+    <w:name w:val="Hyperlink"/>
+    <w:basedOn w:val="Policepardfaut"/>
+    <w:uiPriority w:val="99"/>
+    <w:unhideWhenUsed/>
+    <w:rsid w:val="00C4673C"/>
+    <w:rPr>
+      <w:color w:val="467886" w:themeColor="hyperlink"/>
+      <w:u w:val="single"/>
+    </w:rPr>
+  </w:style>
 </w:styles>
 </file>
 

</xml_diff>